<commit_message>
Migrate to Next.js and fix email typo
</commit_message>
<xml_diff>
--- a/TO RUDAIRO WEBSITE.docx
+++ b/TO RUDAIRO WEBSITE.docx
@@ -404,7 +404,7 @@
           <w:lang w:val="en-ZW" w:eastAsia="en-GB"/>
         </w:rPr>
         <w:pict>
-          <v:rect id="_x0000_i1025" alt="" style="width:451.3pt;height:.05pt;mso-width-percent:0;mso-height-percent:0;mso-width-percent:0;mso-height-percent:0" o:hralign="center" o:hrstd="t" o:hr="t" fillcolor="#a0a0a0" stroked="f"/>
+          <v:rect id="_x0000_i1025" style="width:451.3pt;height:.05pt" o:hralign="center" o:hrstd="t" o:hr="t" fillcolor="#a0a0a0" stroked="f"/>
         </w:pict>
       </w:r>
     </w:p>
@@ -482,7 +482,7 @@
           <w:lang w:val="en-ZW" w:eastAsia="en-GB"/>
         </w:rPr>
         <w:pict>
-          <v:rect id="_x0000_i1026" alt="" style="width:451.3pt;height:.05pt;mso-width-percent:0;mso-height-percent:0;mso-width-percent:0;mso-height-percent:0" o:hralign="center" o:hrstd="t" o:hr="t" fillcolor="#a0a0a0" stroked="f"/>
+          <v:rect id="_x0000_i1026" style="width:451.3pt;height:.05pt" o:hralign="center" o:hrstd="t" o:hr="t" fillcolor="#a0a0a0" stroked="f"/>
         </w:pict>
       </w:r>
     </w:p>
@@ -600,7 +600,7 @@
           <w:lang w:val="en-ZW" w:eastAsia="en-GB"/>
         </w:rPr>
         <w:pict>
-          <v:rect id="_x0000_i1027" alt="" style="width:451.3pt;height:.05pt;mso-width-percent:0;mso-height-percent:0;mso-width-percent:0;mso-height-percent:0" o:hralign="center" o:hrstd="t" o:hr="t" fillcolor="#a0a0a0" stroked="f"/>
+          <v:rect id="_x0000_i1027" style="width:451.3pt;height:.05pt" o:hralign="center" o:hrstd="t" o:hr="t" fillcolor="#a0a0a0" stroked="f"/>
         </w:pict>
       </w:r>
     </w:p>
@@ -719,7 +719,7 @@
           <w:lang w:val="en-ZW" w:eastAsia="en-GB"/>
         </w:rPr>
         <w:pict>
-          <v:rect id="_x0000_i1028" alt="" style="width:451.3pt;height:.05pt;mso-width-percent:0;mso-height-percent:0;mso-width-percent:0;mso-height-percent:0" o:hralign="center" o:hrstd="t" o:hr="t" fillcolor="#a0a0a0" stroked="f"/>
+          <v:rect id="_x0000_i1028" style="width:451.3pt;height:.05pt" o:hralign="center" o:hrstd="t" o:hr="t" fillcolor="#a0a0a0" stroked="f"/>
         </w:pict>
       </w:r>
     </w:p>
@@ -797,7 +797,7 @@
           <w:lang w:val="en-ZW" w:eastAsia="en-GB"/>
         </w:rPr>
         <w:pict>
-          <v:rect id="_x0000_i1029" alt="" style="width:451.3pt;height:.05pt;mso-width-percent:0;mso-height-percent:0;mso-width-percent:0;mso-height-percent:0" o:hralign="center" o:hrstd="t" o:hr="t" fillcolor="#a0a0a0" stroked="f"/>
+          <v:rect id="_x0000_i1029" style="width:451.3pt;height:.05pt" o:hralign="center" o:hrstd="t" o:hr="t" fillcolor="#a0a0a0" stroked="f"/>
         </w:pict>
       </w:r>
     </w:p>
@@ -875,7 +875,7 @@
           <w:lang w:val="en-ZW" w:eastAsia="en-GB"/>
         </w:rPr>
         <w:pict>
-          <v:rect id="_x0000_i1030" alt="" style="width:451.3pt;height:.05pt;mso-width-percent:0;mso-height-percent:0;mso-width-percent:0;mso-height-percent:0" o:hralign="center" o:hrstd="t" o:hr="t" fillcolor="#a0a0a0" stroked="f"/>
+          <v:rect id="_x0000_i1030" style="width:451.3pt;height:.05pt" o:hralign="center" o:hrstd="t" o:hr="t" fillcolor="#a0a0a0" stroked="f"/>
         </w:pict>
       </w:r>
     </w:p>
@@ -977,7 +977,7 @@
           <w:lang w:val="en-ZW" w:eastAsia="en-GB"/>
         </w:rPr>
         <w:pict>
-          <v:rect id="_x0000_i1031" alt="" style="width:451.3pt;height:.05pt;mso-width-percent:0;mso-height-percent:0;mso-width-percent:0;mso-height-percent:0" o:hralign="center" o:hrstd="t" o:hr="t" fillcolor="#a0a0a0" stroked="f"/>
+          <v:rect id="_x0000_i1031" style="width:451.3pt;height:.05pt" o:hralign="center" o:hrstd="t" o:hr="t" fillcolor="#a0a0a0" stroked="f"/>
         </w:pict>
       </w:r>
     </w:p>
@@ -1055,7 +1055,7 @@
           <w:lang w:val="en-ZW" w:eastAsia="en-GB"/>
         </w:rPr>
         <w:pict>
-          <v:rect id="_x0000_i1032" alt="" style="width:451.3pt;height:.05pt;mso-width-percent:0;mso-height-percent:0;mso-width-percent:0;mso-height-percent:0" o:hralign="center" o:hrstd="t" o:hr="t" fillcolor="#a0a0a0" stroked="f"/>
+          <v:rect id="_x0000_i1032" style="width:451.3pt;height:.05pt" o:hralign="center" o:hrstd="t" o:hr="t" fillcolor="#a0a0a0" stroked="f"/>
         </w:pict>
       </w:r>
     </w:p>
@@ -1157,7 +1157,7 @@
           <w:lang w:val="en-ZW" w:eastAsia="en-GB"/>
         </w:rPr>
         <w:pict>
-          <v:rect id="_x0000_i1033" alt="" style="width:451.3pt;height:.05pt;mso-width-percent:0;mso-height-percent:0;mso-width-percent:0;mso-height-percent:0" o:hralign="center" o:hrstd="t" o:hr="t" fillcolor="#a0a0a0" stroked="f"/>
+          <v:rect id="_x0000_i1033" style="width:451.3pt;height:.05pt" o:hralign="center" o:hrstd="t" o:hr="t" fillcolor="#a0a0a0" stroked="f"/>
         </w:pict>
       </w:r>
     </w:p>
@@ -1290,7 +1290,7 @@
           <w:lang w:val="en-ZW" w:eastAsia="en-GB"/>
         </w:rPr>
         <w:pict>
-          <v:rect id="_x0000_i1034" alt="" style="width:451.3pt;height:.05pt;mso-width-percent:0;mso-height-percent:0;mso-width-percent:0;mso-height-percent:0" o:hralign="center" o:hrstd="t" o:hr="t" fillcolor="#a0a0a0" stroked="f"/>
+          <v:rect id="_x0000_i1034" style="width:451.3pt;height:.05pt" o:hralign="center" o:hrstd="t" o:hr="t" fillcolor="#a0a0a0" stroked="f"/>
         </w:pict>
       </w:r>
     </w:p>
@@ -1508,7 +1508,7 @@
           <w:lang w:val="en-ZW" w:eastAsia="en-GB"/>
         </w:rPr>
         <w:pict>
-          <v:rect id="_x0000_i1035" alt="" style="width:451.3pt;height:.05pt;mso-width-percent:0;mso-height-percent:0;mso-width-percent:0;mso-height-percent:0" o:hralign="center" o:hrstd="t" o:hr="t" fillcolor="#a0a0a0" stroked="f"/>
+          <v:rect id="_x0000_i1035" style="width:451.3pt;height:.05pt" o:hralign="center" o:hrstd="t" o:hr="t" fillcolor="#a0a0a0" stroked="f"/>
         </w:pict>
       </w:r>
     </w:p>
@@ -1636,7 +1636,7 @@
           <w:lang w:val="en-ZW" w:eastAsia="en-GB"/>
         </w:rPr>
         <w:pict>
-          <v:rect id="_x0000_i1036" alt="" style="width:451.3pt;height:.05pt;mso-width-percent:0;mso-height-percent:0;mso-width-percent:0;mso-height-percent:0" o:hralign="center" o:hrstd="t" o:hr="t" fillcolor="#a0a0a0" stroked="f"/>
+          <v:rect id="_x0000_i1036" style="width:451.3pt;height:.05pt" o:hralign="center" o:hrstd="t" o:hr="t" fillcolor="#a0a0a0" stroked="f"/>
         </w:pict>
       </w:r>
     </w:p>
@@ -1740,7 +1740,7 @@
           <w:lang w:val="en-ZW" w:eastAsia="en-GB"/>
         </w:rPr>
         <w:pict>
-          <v:rect id="_x0000_i1037" alt="" style="width:451.3pt;height:.05pt;mso-width-percent:0;mso-height-percent:0;mso-width-percent:0;mso-height-percent:0" o:hralign="center" o:hrstd="t" o:hr="t" fillcolor="#a0a0a0" stroked="f"/>
+          <v:rect id="_x0000_i1037" style="width:451.3pt;height:.05pt" o:hralign="center" o:hrstd="t" o:hr="t" fillcolor="#a0a0a0" stroked="f"/>
         </w:pict>
       </w:r>
     </w:p>
@@ -1842,7 +1842,7 @@
           <w:lang w:val="en-ZW" w:eastAsia="en-GB"/>
         </w:rPr>
         <w:pict>
-          <v:rect id="_x0000_i1038" alt="" style="width:451.3pt;height:.05pt;mso-width-percent:0;mso-height-percent:0;mso-width-percent:0;mso-height-percent:0" o:hralign="center" o:hrstd="t" o:hr="t" fillcolor="#a0a0a0" stroked="f"/>
+          <v:rect id="_x0000_i1038" style="width:451.3pt;height:.05pt" o:hralign="center" o:hrstd="t" o:hr="t" fillcolor="#a0a0a0" stroked="f"/>
         </w:pict>
       </w:r>
     </w:p>
@@ -2057,7 +2057,7 @@
           <w:lang w:val="en-ZW" w:eastAsia="en-GB"/>
         </w:rPr>
         <w:pict>
-          <v:rect id="_x0000_i1039" alt="" style="width:451.3pt;height:.05pt;mso-width-percent:0;mso-height-percent:0;mso-width-percent:0;mso-height-percent:0" o:hralign="center" o:hrstd="t" o:hr="t" fillcolor="#a0a0a0" stroked="f"/>
+          <v:rect id="_x0000_i1039" style="width:451.3pt;height:.05pt" o:hralign="center" o:hrstd="t" o:hr="t" fillcolor="#a0a0a0" stroked="f"/>
         </w:pict>
       </w:r>
     </w:p>
@@ -2215,7 +2215,7 @@
           <w:lang w:val="en-ZW" w:eastAsia="en-GB"/>
         </w:rPr>
         <w:pict>
-          <v:rect id="_x0000_i1040" alt="" style="width:451.3pt;height:.05pt;mso-width-percent:0;mso-height-percent:0;mso-width-percent:0;mso-height-percent:0" o:hralign="center" o:hrstd="t" o:hr="t" fillcolor="#a0a0a0" stroked="f"/>
+          <v:rect id="_x0000_i1040" style="width:451.3pt;height:.05pt" o:hralign="center" o:hrstd="t" o:hr="t" fillcolor="#a0a0a0" stroked="f"/>
         </w:pict>
       </w:r>
     </w:p>
@@ -2373,7 +2373,7 @@
           <w:lang w:val="en-ZW" w:eastAsia="en-GB"/>
         </w:rPr>
         <w:pict>
-          <v:rect id="_x0000_i1041" alt="" style="width:451.3pt;height:.05pt;mso-width-percent:0;mso-height-percent:0;mso-width-percent:0;mso-height-percent:0" o:hralign="center" o:hrstd="t" o:hr="t" fillcolor="#a0a0a0" stroked="f"/>
+          <v:rect id="_x0000_i1041" style="width:451.3pt;height:.05pt" o:hralign="center" o:hrstd="t" o:hr="t" fillcolor="#a0a0a0" stroked="f"/>
         </w:pict>
       </w:r>
     </w:p>
@@ -2568,7 +2568,7 @@
           <w:lang w:val="en-ZW" w:eastAsia="en-GB"/>
         </w:rPr>
         <w:pict>
-          <v:rect id="_x0000_i1042" alt="" style="width:451.3pt;height:.05pt;mso-width-percent:0;mso-height-percent:0;mso-width-percent:0;mso-height-percent:0" o:hralign="center" o:hrstd="t" o:hr="t" fillcolor="#a0a0a0" stroked="f"/>
+          <v:rect id="_x0000_i1042" style="width:451.3pt;height:.05pt" o:hralign="center" o:hrstd="t" o:hr="t" fillcolor="#a0a0a0" stroked="f"/>
         </w:pict>
       </w:r>
     </w:p>
@@ -2734,7 +2734,7 @@
           <w:lang w:val="en-ZW" w:eastAsia="en-GB"/>
         </w:rPr>
         <w:pict>
-          <v:rect id="_x0000_i1043" alt="" style="width:451.3pt;height:.05pt;mso-width-percent:0;mso-height-percent:0;mso-width-percent:0;mso-height-percent:0" o:hralign="center" o:hrstd="t" o:hr="t" fillcolor="#a0a0a0" stroked="f"/>
+          <v:rect id="_x0000_i1043" style="width:451.3pt;height:.05pt" o:hralign="center" o:hrstd="t" o:hr="t" fillcolor="#a0a0a0" stroked="f"/>
         </w:pict>
       </w:r>
     </w:p>
@@ -2758,7 +2758,7 @@
         </w:rPr>
         <w:lastRenderedPageBreak/>
         <w:pict>
-          <v:rect id="_x0000_i1044" alt="" style="width:451.3pt;height:.05pt;mso-width-percent:0;mso-height-percent:0;mso-width-percent:0;mso-height-percent:0" o:hralign="center" o:hrstd="t" o:hr="t" fillcolor="#a0a0a0" stroked="f"/>
+          <v:rect id="_x0000_i1044" style="width:451.3pt;height:.05pt" o:hralign="center" o:hrstd="t" o:hr="t" fillcolor="#a0a0a0" stroked="f"/>
         </w:pict>
       </w:r>
     </w:p>
@@ -2836,7 +2836,7 @@
           <w:lang w:val="en-ZW" w:eastAsia="en-GB"/>
         </w:rPr>
         <w:pict>
-          <v:rect id="_x0000_i1045" alt="" style="width:451.3pt;height:.05pt;mso-width-percent:0;mso-height-percent:0;mso-width-percent:0;mso-height-percent:0" o:hralign="center" o:hrstd="t" o:hr="t" fillcolor="#a0a0a0" stroked="f"/>
+          <v:rect id="_x0000_i1045" style="width:451.3pt;height:.05pt" o:hralign="center" o:hrstd="t" o:hr="t" fillcolor="#a0a0a0" stroked="f"/>
         </w:pict>
       </w:r>
     </w:p>
@@ -2914,7 +2914,7 @@
           <w:lang w:val="en-ZW" w:eastAsia="en-GB"/>
         </w:rPr>
         <w:pict>
-          <v:rect id="_x0000_i1046" alt="" style="width:451.3pt;height:.05pt;mso-width-percent:0;mso-height-percent:0;mso-width-percent:0;mso-height-percent:0" o:hralign="center" o:hrstd="t" o:hr="t" fillcolor="#a0a0a0" stroked="f"/>
+          <v:rect id="_x0000_i1046" style="width:451.3pt;height:.05pt" o:hralign="center" o:hrstd="t" o:hr="t" fillcolor="#a0a0a0" stroked="f"/>
         </w:pict>
       </w:r>
     </w:p>
@@ -3051,7 +3051,7 @@
           <w:lang w:val="en-ZW" w:eastAsia="en-GB"/>
         </w:rPr>
         <w:pict>
-          <v:rect id="_x0000_i1047" alt="" style="width:451.3pt;height:.05pt;mso-width-percent:0;mso-height-percent:0;mso-width-percent:0;mso-height-percent:0" o:hralign="center" o:hrstd="t" o:hr="t" fillcolor="#a0a0a0" stroked="f"/>
+          <v:rect id="_x0000_i1047" style="width:451.3pt;height:.05pt" o:hralign="center" o:hrstd="t" o:hr="t" fillcolor="#a0a0a0" stroked="f"/>
         </w:pict>
       </w:r>
     </w:p>
@@ -3207,7 +3207,7 @@
           <w:lang w:val="en-ZW" w:eastAsia="en-GB"/>
         </w:rPr>
         <w:pict>
-          <v:rect id="_x0000_i1048" alt="" style="width:451.3pt;height:.05pt;mso-width-percent:0;mso-height-percent:0;mso-width-percent:0;mso-height-percent:0" o:hralign="center" o:hrstd="t" o:hr="t" fillcolor="#a0a0a0" stroked="f"/>
+          <v:rect id="_x0000_i1048" style="width:451.3pt;height:.05pt" o:hralign="center" o:hrstd="t" o:hr="t" fillcolor="#a0a0a0" stroked="f"/>
         </w:pict>
       </w:r>
     </w:p>
@@ -3307,7 +3307,7 @@
           <w:lang w:val="en-ZW" w:eastAsia="en-GB"/>
         </w:rPr>
         <w:pict>
-          <v:rect id="_x0000_i1049" alt="" style="width:451.3pt;height:.05pt;mso-width-percent:0;mso-height-percent:0;mso-width-percent:0;mso-height-percent:0" o:hralign="center" o:hrstd="t" o:hr="t" fillcolor="#a0a0a0" stroked="f"/>
+          <v:rect id="_x0000_i1049" style="width:451.3pt;height:.05pt" o:hralign="center" o:hrstd="t" o:hr="t" fillcolor="#a0a0a0" stroked="f"/>
         </w:pict>
       </w:r>
     </w:p>
@@ -3466,7 +3466,7 @@
           <w:lang w:val="en-ZW" w:eastAsia="en-GB"/>
         </w:rPr>
         <w:pict>
-          <v:rect id="_x0000_i1050" alt="" style="width:451.3pt;height:.05pt;mso-width-percent:0;mso-height-percent:0;mso-width-percent:0;mso-height-percent:0" o:hralign="center" o:hrstd="t" o:hr="t" fillcolor="#a0a0a0" stroked="f"/>
+          <v:rect id="_x0000_i1050" style="width:451.3pt;height:.05pt" o:hralign="center" o:hrstd="t" o:hr="t" fillcolor="#a0a0a0" stroked="f"/>
         </w:pict>
       </w:r>
     </w:p>
@@ -3628,7 +3628,7 @@
           <w:lang w:val="en-ZW" w:eastAsia="en-GB"/>
         </w:rPr>
         <w:pict>
-          <v:rect id="_x0000_i1051" alt="" style="width:451.3pt;height:.05pt;mso-width-percent:0;mso-height-percent:0;mso-width-percent:0;mso-height-percent:0" o:hralign="center" o:hrstd="t" o:hr="t" fillcolor="#a0a0a0" stroked="f"/>
+          <v:rect id="_x0000_i1051" style="width:451.3pt;height:.05pt" o:hralign="center" o:hrstd="t" o:hr="t" fillcolor="#a0a0a0" stroked="f"/>
         </w:pict>
       </w:r>
     </w:p>
@@ -3762,7 +3762,7 @@
           <w:lang w:val="en-ZW" w:eastAsia="en-GB"/>
         </w:rPr>
         <w:pict>
-          <v:rect id="_x0000_i1052" alt="" style="width:451.3pt;height:.05pt;mso-width-percent:0;mso-height-percent:0;mso-width-percent:0;mso-height-percent:0" o:hralign="center" o:hrstd="t" o:hr="t" fillcolor="#a0a0a0" stroked="f"/>
+          <v:rect id="_x0000_i1052" style="width:451.3pt;height:.05pt" o:hralign="center" o:hrstd="t" o:hr="t" fillcolor="#a0a0a0" stroked="f"/>
         </w:pict>
       </w:r>
     </w:p>
@@ -3948,7 +3948,7 @@
           <w:lang w:val="en-ZW" w:eastAsia="en-GB"/>
         </w:rPr>
         <w:pict>
-          <v:rect id="_x0000_i1053" alt="" style="width:451.3pt;height:.05pt;mso-width-percent:0;mso-height-percent:0;mso-width-percent:0;mso-height-percent:0" o:hralign="center" o:hrstd="t" o:hr="t" fillcolor="#a0a0a0" stroked="f"/>
+          <v:rect id="_x0000_i1053" style="width:451.3pt;height:.05pt" o:hralign="center" o:hrstd="t" o:hr="t" fillcolor="#a0a0a0" stroked="f"/>
         </w:pict>
       </w:r>
     </w:p>
@@ -4110,7 +4110,7 @@
           <w:lang w:val="en-ZW" w:eastAsia="en-GB"/>
         </w:rPr>
         <w:pict>
-          <v:rect id="_x0000_i1054" alt="" style="width:451.3pt;height:.05pt;mso-width-percent:0;mso-height-percent:0;mso-width-percent:0;mso-height-percent:0" o:hralign="center" o:hrstd="t" o:hr="t" fillcolor="#a0a0a0" stroked="f"/>
+          <v:rect id="_x0000_i1054" style="width:451.3pt;height:.05pt" o:hralign="center" o:hrstd="t" o:hr="t" fillcolor="#a0a0a0" stroked="f"/>
         </w:pict>
       </w:r>
     </w:p>
@@ -4273,7 +4273,7 @@
         </w:rPr>
         <w:lastRenderedPageBreak/>
         <w:pict>
-          <v:rect id="_x0000_i1055" alt="" style="width:451.3pt;height:.05pt;mso-width-percent:0;mso-height-percent:0;mso-width-percent:0;mso-height-percent:0" o:hralign="center" o:hrstd="t" o:hr="t" fillcolor="#a0a0a0" stroked="f"/>
+          <v:rect id="_x0000_i1055" style="width:451.3pt;height:.05pt" o:hralign="center" o:hrstd="t" o:hr="t" fillcolor="#a0a0a0" stroked="f"/>
         </w:pict>
       </w:r>
     </w:p>
@@ -4455,7 +4455,7 @@
           <w:lang w:val="en-ZW" w:eastAsia="en-GB"/>
         </w:rPr>
         <w:pict>
-          <v:rect id="_x0000_i1056" alt="" style="width:451.3pt;height:.05pt;mso-width-percent:0;mso-height-percent:0;mso-width-percent:0;mso-height-percent:0" o:hralign="center" o:hrstd="t" o:hr="t" fillcolor="#a0a0a0" stroked="f"/>
+          <v:rect id="_x0000_i1056" style="width:451.3pt;height:.05pt" o:hralign="center" o:hrstd="t" o:hr="t" fillcolor="#a0a0a0" stroked="f"/>
         </w:pict>
       </w:r>
     </w:p>
@@ -4565,7 +4565,7 @@
           <w:lang w:val="en-ZW" w:eastAsia="en-GB"/>
         </w:rPr>
         <w:pict>
-          <v:rect id="_x0000_i1057" alt="" style="width:451.3pt;height:.05pt;mso-width-percent:0;mso-height-percent:0;mso-width-percent:0;mso-height-percent:0" o:hralign="center" o:hrstd="t" o:hr="t" fillcolor="#a0a0a0" stroked="f"/>
+          <v:rect id="_x0000_i1057" style="width:451.3pt;height:.05pt" o:hralign="center" o:hrstd="t" o:hr="t" fillcolor="#a0a0a0" stroked="f"/>
         </w:pict>
       </w:r>
     </w:p>
@@ -4643,7 +4643,7 @@
           <w:lang w:val="en-ZW" w:eastAsia="en-GB"/>
         </w:rPr>
         <w:pict>
-          <v:rect id="_x0000_i1058" alt="" style="width:451.3pt;height:.05pt;mso-width-percent:0;mso-height-percent:0;mso-width-percent:0;mso-height-percent:0" o:hralign="center" o:hrstd="t" o:hr="t" fillcolor="#a0a0a0" stroked="f"/>
+          <v:rect id="_x0000_i1058" style="width:451.3pt;height:.05pt" o:hralign="center" o:hrstd="t" o:hr="t" fillcolor="#a0a0a0" stroked="f"/>
         </w:pict>
       </w:r>
     </w:p>
@@ -4825,7 +4825,7 @@
           <w:lang w:val="en-ZW" w:eastAsia="en-GB"/>
         </w:rPr>
         <w:pict>
-          <v:rect id="_x0000_i1059" alt="" style="width:451.3pt;height:.05pt;mso-width-percent:0;mso-height-percent:0;mso-width-percent:0;mso-height-percent:0" o:hralign="center" o:hrstd="t" o:hr="t" fillcolor="#a0a0a0" stroked="f"/>
+          <v:rect id="_x0000_i1059" style="width:451.3pt;height:.05pt" o:hralign="center" o:hrstd="t" o:hr="t" fillcolor="#a0a0a0" stroked="f"/>
         </w:pict>
       </w:r>
     </w:p>
@@ -4903,7 +4903,7 @@
           <w:lang w:val="en-ZW" w:eastAsia="en-GB"/>
         </w:rPr>
         <w:pict>
-          <v:rect id="_x0000_i1060" alt="" style="width:451.3pt;height:.05pt;mso-width-percent:0;mso-height-percent:0;mso-width-percent:0;mso-height-percent:0" o:hralign="center" o:hrstd="t" o:hr="t" fillcolor="#a0a0a0" stroked="f"/>
+          <v:rect id="_x0000_i1060" style="width:451.3pt;height:.05pt" o:hralign="center" o:hrstd="t" o:hr="t" fillcolor="#a0a0a0" stroked="f"/>
         </w:pict>
       </w:r>
     </w:p>
@@ -5077,7 +5077,7 @@
           <w:lang w:val="en-ZW" w:eastAsia="en-GB"/>
         </w:rPr>
         <w:pict>
-          <v:rect id="_x0000_i1061" alt="" style="width:451.3pt;height:.05pt;mso-width-percent:0;mso-height-percent:0;mso-width-percent:0;mso-height-percent:0" o:hralign="center" o:hrstd="t" o:hr="t" fillcolor="#a0a0a0" stroked="f"/>
+          <v:rect id="_x0000_i1061" style="width:451.3pt;height:.05pt" o:hralign="center" o:hrstd="t" o:hr="t" fillcolor="#a0a0a0" stroked="f"/>
         </w:pict>
       </w:r>
     </w:p>
@@ -7788,8 +7788,6 @@
       <w:r>
         <w:t>Nestling space: mental health &amp; wellness</w:t>
       </w:r>
-      <w:bookmarkStart w:id="0" w:name="_GoBack"/>
-      <w:bookmarkEnd w:id="0"/>
     </w:p>
     <w:p>
       <w:r>
@@ -7903,32 +7901,17 @@
       </w:r>
     </w:p>
     <w:p>
-      <w:pPr>
-        <w:rPr>
-          <w:i/>
-          <w:iCs/>
-          <w:color w:val="FF0000"/>
-        </w:rPr>
-      </w:pPr>
-      <w:r>
+      <w:r>
+        <w:lastRenderedPageBreak/>
         <w:t xml:space="preserve">  </w:t>
       </w:r>
-      <w:r>
-        <w:rPr>
-          <w:i/>
-          <w:iCs/>
-          <w:color w:val="FF0000"/>
-        </w:rPr>
-        <w:t>THIS IS FOR YOU TO SEE WHAT INFORMATION YOU CAN MAKE OUT OF THE BOOKING PAGE</w:t>
-      </w:r>
-    </w:p>
-    <w:p>
+      <w:bookmarkStart w:id="0" w:name="_GoBack"/>
+      <w:bookmarkEnd w:id="0"/>
       <w:r>
         <w:rPr>
           <w:noProof/>
           <w:lang w:eastAsia="en-GB"/>
         </w:rPr>
-        <w:lastRenderedPageBreak/>
         <w:drawing>
           <wp:inline distT="0" distB="0" distL="0" distR="0" wp14:anchorId="21F83F7D" wp14:editId="5ADFE5B6">
             <wp:extent cx="5731510" cy="2987040"/>

</xml_diff>